<commit_message>
email fix and user manual
</commit_message>
<xml_diff>
--- a/docs/FFG-Recon-User-Manual.docx
+++ b/docs/FFG-Recon-User-Manual.docx
@@ -201,6 +201,110 @@
       </w:pPr>
       <w:r>
         <w:t>Click Set password. You are now logged in.</w:t>
+      </w:r>
+    </w:p>
+    <w:p>
+      <w:pPr>
+        <w:jc w:val="center"/>
+      </w:pPr>
+      <w:r>
+        <w:drawing>
+          <wp:inline xmlns:a="http://schemas.openxmlformats.org/drawingml/2006/main" xmlns:pic="http://schemas.openxmlformats.org/drawingml/2006/picture">
+            <wp:extent cx="5029200" cy="10888660"/>
+            <wp:docPr id="1" name="Picture 1"/>
+            <wp:cNvGraphicFramePr>
+              <a:graphicFrameLocks noChangeAspect="1"/>
+            </wp:cNvGraphicFramePr>
+            <a:graphic>
+              <a:graphicData uri="http://schemas.openxmlformats.org/drawingml/2006/picture">
+                <pic:pic>
+                  <pic:nvPicPr>
+                    <pic:cNvPr id="0" name="01-login.png"/>
+                    <pic:cNvPicPr/>
+                  </pic:nvPicPr>
+                  <pic:blipFill>
+                    <a:blip r:embed="rId9"/>
+                    <a:stretch>
+                      <a:fillRect/>
+                    </a:stretch>
+                  </pic:blipFill>
+                  <pic:spPr>
+                    <a:xfrm>
+                      <a:off x="0" y="0"/>
+                      <a:ext cx="5029200" cy="10888660"/>
+                    </a:xfrm>
+                    <a:prstGeom prst="rect"/>
+                  </pic:spPr>
+                </pic:pic>
+              </a:graphicData>
+            </a:graphic>
+          </wp:inline>
+        </w:drawing>
+      </w:r>
+    </w:p>
+    <w:p>
+      <w:pPr>
+        <w:jc w:val="center"/>
+      </w:pPr>
+      <w:r>
+        <w:rPr>
+          <w:i/>
+          <w:color w:val="666666"/>
+          <w:sz w:val="18"/>
+        </w:rPr>
+        <w:t>Figure: The login screen.</w:t>
+      </w:r>
+    </w:p>
+    <w:p>
+      <w:pPr>
+        <w:jc w:val="center"/>
+      </w:pPr>
+      <w:r>
+        <w:drawing>
+          <wp:inline xmlns:a="http://schemas.openxmlformats.org/drawingml/2006/main" xmlns:pic="http://schemas.openxmlformats.org/drawingml/2006/picture">
+            <wp:extent cx="5029200" cy="10888660"/>
+            <wp:docPr id="2" name="Picture 2"/>
+            <wp:cNvGraphicFramePr>
+              <a:graphicFrameLocks noChangeAspect="1"/>
+            </wp:cNvGraphicFramePr>
+            <a:graphic>
+              <a:graphicData uri="http://schemas.openxmlformats.org/drawingml/2006/picture">
+                <pic:pic>
+                  <pic:nvPicPr>
+                    <pic:cNvPr id="0" name="02-change-password.png"/>
+                    <pic:cNvPicPr/>
+                  </pic:nvPicPr>
+                  <pic:blipFill>
+                    <a:blip r:embed="rId10"/>
+                    <a:stretch>
+                      <a:fillRect/>
+                    </a:stretch>
+                  </pic:blipFill>
+                  <pic:spPr>
+                    <a:xfrm>
+                      <a:off x="0" y="0"/>
+                      <a:ext cx="5029200" cy="10888660"/>
+                    </a:xfrm>
+                    <a:prstGeom prst="rect"/>
+                  </pic:spPr>
+                </pic:pic>
+              </a:graphicData>
+            </a:graphic>
+          </wp:inline>
+        </w:drawing>
+      </w:r>
+    </w:p>
+    <w:p>
+      <w:pPr>
+        <w:jc w:val="center"/>
+      </w:pPr>
+      <w:r>
+        <w:rPr>
+          <w:i/>
+          <w:color w:val="666666"/>
+          <w:sz w:val="18"/>
+        </w:rPr>
+        <w:t>Figure: The forced-reset screen after first login.</w:t>
       </w:r>
     </w:p>
     <w:p>
@@ -594,6 +698,58 @@
     </w:p>
     <w:p>
       <w:pPr>
+        <w:jc w:val="center"/>
+      </w:pPr>
+      <w:r>
+        <w:drawing>
+          <wp:inline xmlns:a="http://schemas.openxmlformats.org/drawingml/2006/main" xmlns:pic="http://schemas.openxmlformats.org/drawingml/2006/picture">
+            <wp:extent cx="3200400" cy="6929147"/>
+            <wp:docPr id="3" name="Picture 3"/>
+            <wp:cNvGraphicFramePr>
+              <a:graphicFrameLocks noChangeAspect="1"/>
+            </wp:cNvGraphicFramePr>
+            <a:graphic>
+              <a:graphicData uri="http://schemas.openxmlformats.org/drawingml/2006/picture">
+                <pic:pic>
+                  <pic:nvPicPr>
+                    <pic:cNvPr id="0" name="05-mobile-home.png"/>
+                    <pic:cNvPicPr/>
+                  </pic:nvPicPr>
+                  <pic:blipFill>
+                    <a:blip r:embed="rId11"/>
+                    <a:stretch>
+                      <a:fillRect/>
+                    </a:stretch>
+                  </pic:blipFill>
+                  <pic:spPr>
+                    <a:xfrm>
+                      <a:off x="0" y="0"/>
+                      <a:ext cx="3200400" cy="6929147"/>
+                    </a:xfrm>
+                    <a:prstGeom prst="rect"/>
+                  </pic:spPr>
+                </pic:pic>
+              </a:graphicData>
+            </a:graphic>
+          </wp:inline>
+        </w:drawing>
+      </w:r>
+    </w:p>
+    <w:p>
+      <w:pPr>
+        <w:jc w:val="center"/>
+      </w:pPr>
+      <w:r>
+        <w:rPr>
+          <w:i/>
+          <w:color w:val="666666"/>
+          <w:sz w:val="18"/>
+        </w:rPr>
+        <w:t>Figure: Mobile home screen with bottom navigation.</w:t>
+      </w:r>
+    </w:p>
+    <w:p>
+      <w:pPr>
         <w:pStyle w:val="Heading2"/>
       </w:pPr>
       <w:r>
@@ -626,6 +782,58 @@
     </w:p>
     <w:p>
       <w:pPr>
+        <w:jc w:val="center"/>
+      </w:pPr>
+      <w:r>
+        <w:drawing>
+          <wp:inline xmlns:a="http://schemas.openxmlformats.org/drawingml/2006/main" xmlns:pic="http://schemas.openxmlformats.org/drawingml/2006/picture">
+            <wp:extent cx="4572000" cy="9898782"/>
+            <wp:docPr id="4" name="Picture 4"/>
+            <wp:cNvGraphicFramePr>
+              <a:graphicFrameLocks noChangeAspect="1"/>
+            </wp:cNvGraphicFramePr>
+            <a:graphic>
+              <a:graphicData uri="http://schemas.openxmlformats.org/drawingml/2006/picture">
+                <pic:pic>
+                  <pic:nvPicPr>
+                    <pic:cNvPr id="0" name="06-mobile-topbar.jpg"/>
+                    <pic:cNvPicPr/>
+                  </pic:nvPicPr>
+                  <pic:blipFill>
+                    <a:blip r:embed="rId12"/>
+                    <a:stretch>
+                      <a:fillRect/>
+                    </a:stretch>
+                  </pic:blipFill>
+                  <pic:spPr>
+                    <a:xfrm>
+                      <a:off x="0" y="0"/>
+                      <a:ext cx="4572000" cy="9898782"/>
+                    </a:xfrm>
+                    <a:prstGeom prst="rect"/>
+                  </pic:spPr>
+                </pic:pic>
+              </a:graphicData>
+            </a:graphic>
+          </wp:inline>
+        </w:drawing>
+      </w:r>
+    </w:p>
+    <w:p>
+      <w:pPr>
+        <w:jc w:val="center"/>
+      </w:pPr>
+      <w:r>
+        <w:rPr>
+          <w:i/>
+          <w:color w:val="666666"/>
+          <w:sz w:val="18"/>
+        </w:rPr>
+        <w:t>Figure: The mobile top bar close-up.</w:t>
+      </w:r>
+    </w:p>
+    <w:p>
+      <w:pPr>
         <w:pStyle w:val="Heading2"/>
       </w:pPr>
       <w:r>
@@ -769,6 +977,110 @@
     </w:p>
     <w:p>
       <w:pPr>
+        <w:jc w:val="center"/>
+      </w:pPr>
+      <w:r>
+        <w:drawing>
+          <wp:inline xmlns:a="http://schemas.openxmlformats.org/drawingml/2006/main" xmlns:pic="http://schemas.openxmlformats.org/drawingml/2006/picture">
+            <wp:extent cx="3200400" cy="6929147"/>
+            <wp:docPr id="5" name="Picture 5"/>
+            <wp:cNvGraphicFramePr>
+              <a:graphicFrameLocks noChangeAspect="1"/>
+            </wp:cNvGraphicFramePr>
+            <a:graphic>
+              <a:graphicData uri="http://schemas.openxmlformats.org/drawingml/2006/picture">
+                <pic:pic>
+                  <pic:nvPicPr>
+                    <pic:cNvPr id="0" name="08-upload-empty.jpg"/>
+                    <pic:cNvPicPr/>
+                  </pic:nvPicPr>
+                  <pic:blipFill>
+                    <a:blip r:embed="rId13"/>
+                    <a:stretch>
+                      <a:fillRect/>
+                    </a:stretch>
+                  </pic:blipFill>
+                  <pic:spPr>
+                    <a:xfrm>
+                      <a:off x="0" y="0"/>
+                      <a:ext cx="3200400" cy="6929147"/>
+                    </a:xfrm>
+                    <a:prstGeom prst="rect"/>
+                  </pic:spPr>
+                </pic:pic>
+              </a:graphicData>
+            </a:graphic>
+          </wp:inline>
+        </w:drawing>
+      </w:r>
+    </w:p>
+    <w:p>
+      <w:pPr>
+        <w:jc w:val="center"/>
+      </w:pPr>
+      <w:r>
+        <w:rPr>
+          <w:i/>
+          <w:color w:val="666666"/>
+          <w:sz w:val="18"/>
+        </w:rPr>
+        <w:t>Figure: Upload page before picking a file.</w:t>
+      </w:r>
+    </w:p>
+    <w:p>
+      <w:pPr>
+        <w:jc w:val="center"/>
+      </w:pPr>
+      <w:r>
+        <w:drawing>
+          <wp:inline xmlns:a="http://schemas.openxmlformats.org/drawingml/2006/main" xmlns:pic="http://schemas.openxmlformats.org/drawingml/2006/picture">
+            <wp:extent cx="3200400" cy="6929147"/>
+            <wp:docPr id="6" name="Picture 6"/>
+            <wp:cNvGraphicFramePr>
+              <a:graphicFrameLocks noChangeAspect="1"/>
+            </wp:cNvGraphicFramePr>
+            <a:graphic>
+              <a:graphicData uri="http://schemas.openxmlformats.org/drawingml/2006/picture">
+                <pic:pic>
+                  <pic:nvPicPr>
+                    <pic:cNvPr id="0" name="09-upload-queue.jpg"/>
+                    <pic:cNvPicPr/>
+                  </pic:nvPicPr>
+                  <pic:blipFill>
+                    <a:blip r:embed="rId14"/>
+                    <a:stretch>
+                      <a:fillRect/>
+                    </a:stretch>
+                  </pic:blipFill>
+                  <pic:spPr>
+                    <a:xfrm>
+                      <a:off x="0" y="0"/>
+                      <a:ext cx="3200400" cy="6929147"/>
+                    </a:xfrm>
+                    <a:prstGeom prst="rect"/>
+                  </pic:spPr>
+                </pic:pic>
+              </a:graphicData>
+            </a:graphic>
+          </wp:inline>
+        </w:drawing>
+      </w:r>
+    </w:p>
+    <w:p>
+      <w:pPr>
+        <w:jc w:val="center"/>
+      </w:pPr>
+      <w:r>
+        <w:rPr>
+          <w:i/>
+          <w:color w:val="666666"/>
+          <w:sz w:val="18"/>
+        </w:rPr>
+        <w:t>Figure: A queued file with Reason, Category and Store fields.</w:t>
+      </w:r>
+    </w:p>
+    <w:p>
+      <w:pPr>
         <w:pStyle w:val="Heading2"/>
       </w:pPr>
       <w:r>
@@ -863,6 +1175,58 @@
     <w:p>
       <w:r>
         <w:t>When splits exist, the per-item Category and Store dropdowns are ignored and the split breakdown is used instead.</w:t>
+      </w:r>
+    </w:p>
+    <w:p>
+      <w:pPr>
+        <w:jc w:val="center"/>
+      </w:pPr>
+      <w:r>
+        <w:drawing>
+          <wp:inline xmlns:a="http://schemas.openxmlformats.org/drawingml/2006/main" xmlns:pic="http://schemas.openxmlformats.org/drawingml/2006/picture">
+            <wp:extent cx="3200400" cy="6929147"/>
+            <wp:docPr id="7" name="Picture 7"/>
+            <wp:cNvGraphicFramePr>
+              <a:graphicFrameLocks noChangeAspect="1"/>
+            </wp:cNvGraphicFramePr>
+            <a:graphic>
+              <a:graphicData uri="http://schemas.openxmlformats.org/drawingml/2006/picture">
+                <pic:pic>
+                  <pic:nvPicPr>
+                    <pic:cNvPr id="0" name="10-upload-splits.jpg"/>
+                    <pic:cNvPicPr/>
+                  </pic:nvPicPr>
+                  <pic:blipFill>
+                    <a:blip r:embed="rId15"/>
+                    <a:stretch>
+                      <a:fillRect/>
+                    </a:stretch>
+                  </pic:blipFill>
+                  <pic:spPr>
+                    <a:xfrm>
+                      <a:off x="0" y="0"/>
+                      <a:ext cx="3200400" cy="6929147"/>
+                    </a:xfrm>
+                    <a:prstGeom prst="rect"/>
+                  </pic:spPr>
+                </pic:pic>
+              </a:graphicData>
+            </a:graphic>
+          </wp:inline>
+        </w:drawing>
+      </w:r>
+    </w:p>
+    <w:p>
+      <w:pPr>
+        <w:jc w:val="center"/>
+      </w:pPr>
+      <w:r>
+        <w:rPr>
+          <w:i/>
+          <w:color w:val="666666"/>
+          <w:sz w:val="18"/>
+        </w:rPr>
+        <w:t>Figure: Line splits editor expanded on a queued item.</w:t>
       </w:r>
     </w:p>
     <w:p>
@@ -1069,6 +1433,162 @@
     </w:p>
     <w:p>
       <w:pPr>
+        <w:jc w:val="center"/>
+      </w:pPr>
+      <w:r>
+        <w:drawing>
+          <wp:inline xmlns:a="http://schemas.openxmlformats.org/drawingml/2006/main" xmlns:pic="http://schemas.openxmlformats.org/drawingml/2006/picture">
+            <wp:extent cx="5029200" cy="10888660"/>
+            <wp:docPr id="8" name="Picture 8"/>
+            <wp:cNvGraphicFramePr>
+              <a:graphicFrameLocks noChangeAspect="1"/>
+            </wp:cNvGraphicFramePr>
+            <a:graphic>
+              <a:graphicData uri="http://schemas.openxmlformats.org/drawingml/2006/picture">
+                <pic:pic>
+                  <pic:nvPicPr>
+                    <pic:cNvPr id="0" name="12-invoices-list.png"/>
+                    <pic:cNvPicPr/>
+                  </pic:nvPicPr>
+                  <pic:blipFill>
+                    <a:blip r:embed="rId16"/>
+                    <a:stretch>
+                      <a:fillRect/>
+                    </a:stretch>
+                  </pic:blipFill>
+                  <pic:spPr>
+                    <a:xfrm>
+                      <a:off x="0" y="0"/>
+                      <a:ext cx="5029200" cy="10888660"/>
+                    </a:xfrm>
+                    <a:prstGeom prst="rect"/>
+                  </pic:spPr>
+                </pic:pic>
+              </a:graphicData>
+            </a:graphic>
+          </wp:inline>
+        </w:drawing>
+      </w:r>
+    </w:p>
+    <w:p>
+      <w:pPr>
+        <w:jc w:val="center"/>
+      </w:pPr>
+      <w:r>
+        <w:rPr>
+          <w:i/>
+          <w:color w:val="666666"/>
+          <w:sz w:val="18"/>
+        </w:rPr>
+        <w:t>Figure: Invoices page with orange Match buttons on pending rows.</w:t>
+      </w:r>
+    </w:p>
+    <w:p>
+      <w:pPr>
+        <w:jc w:val="center"/>
+      </w:pPr>
+      <w:r>
+        <w:drawing>
+          <wp:inline xmlns:a="http://schemas.openxmlformats.org/drawingml/2006/main" xmlns:pic="http://schemas.openxmlformats.org/drawingml/2006/picture">
+            <wp:extent cx="5029200" cy="10888660"/>
+            <wp:docPr id="9" name="Picture 9"/>
+            <wp:cNvGraphicFramePr>
+              <a:graphicFrameLocks noChangeAspect="1"/>
+            </wp:cNvGraphicFramePr>
+            <a:graphic>
+              <a:graphicData uri="http://schemas.openxmlformats.org/drawingml/2006/picture">
+                <pic:pic>
+                  <pic:nvPicPr>
+                    <pic:cNvPr id="0" name="13-match-picker.png"/>
+                    <pic:cNvPicPr/>
+                  </pic:nvPicPr>
+                  <pic:blipFill>
+                    <a:blip r:embed="rId17"/>
+                    <a:stretch>
+                      <a:fillRect/>
+                    </a:stretch>
+                  </pic:blipFill>
+                  <pic:spPr>
+                    <a:xfrm>
+                      <a:off x="0" y="0"/>
+                      <a:ext cx="5029200" cy="10888660"/>
+                    </a:xfrm>
+                    <a:prstGeom prst="rect"/>
+                  </pic:spPr>
+                </pic:pic>
+              </a:graphicData>
+            </a:graphic>
+          </wp:inline>
+        </w:drawing>
+      </w:r>
+    </w:p>
+    <w:p>
+      <w:pPr>
+        <w:jc w:val="center"/>
+      </w:pPr>
+      <w:r>
+        <w:rPr>
+          <w:i/>
+          <w:color w:val="666666"/>
+          <w:sz w:val="18"/>
+        </w:rPr>
+        <w:t>Figure: Manual match picker — "likely" badge on the best candidate.</w:t>
+      </w:r>
+    </w:p>
+    <w:p>
+      <w:pPr>
+        <w:jc w:val="center"/>
+      </w:pPr>
+      <w:r>
+        <w:drawing>
+          <wp:inline xmlns:a="http://schemas.openxmlformats.org/drawingml/2006/main" xmlns:pic="http://schemas.openxmlformats.org/drawingml/2006/picture">
+            <wp:extent cx="5029200" cy="10888660"/>
+            <wp:docPr id="10" name="Picture 10"/>
+            <wp:cNvGraphicFramePr>
+              <a:graphicFrameLocks noChangeAspect="1"/>
+            </wp:cNvGraphicFramePr>
+            <a:graphic>
+              <a:graphicData uri="http://schemas.openxmlformats.org/drawingml/2006/picture">
+                <pic:pic>
+                  <pic:nvPicPr>
+                    <pic:cNvPr id="0" name="15-invoice-detail.png"/>
+                    <pic:cNvPicPr/>
+                  </pic:nvPicPr>
+                  <pic:blipFill>
+                    <a:blip r:embed="rId18"/>
+                    <a:stretch>
+                      <a:fillRect/>
+                    </a:stretch>
+                  </pic:blipFill>
+                  <pic:spPr>
+                    <a:xfrm>
+                      <a:off x="0" y="0"/>
+                      <a:ext cx="5029200" cy="10888660"/>
+                    </a:xfrm>
+                    <a:prstGeom prst="rect"/>
+                  </pic:spPr>
+                </pic:pic>
+              </a:graphicData>
+            </a:graphic>
+          </wp:inline>
+        </w:drawing>
+      </w:r>
+    </w:p>
+    <w:p>
+      <w:pPr>
+        <w:jc w:val="center"/>
+      </w:pPr>
+      <w:r>
+        <w:rPr>
+          <w:i/>
+          <w:color w:val="666666"/>
+          <w:sz w:val="18"/>
+        </w:rPr>
+        <w:t>Figure: Invoice detail page — file preview, kind toggle, credit applied, splits and reconciliation.</w:t>
+      </w:r>
+    </w:p>
+    <w:p>
+      <w:pPr>
         <w:pStyle w:val="Heading2"/>
       </w:pPr>
       <w:r>
@@ -1500,6 +2020,58 @@
       </w:pPr>
       <w:r>
         <w:t>Status: POSTED, PENDING, etc.</w:t>
+      </w:r>
+    </w:p>
+    <w:p>
+      <w:pPr>
+        <w:jc w:val="center"/>
+      </w:pPr>
+      <w:r>
+        <w:drawing>
+          <wp:inline xmlns:a="http://schemas.openxmlformats.org/drawingml/2006/main" xmlns:pic="http://schemas.openxmlformats.org/drawingml/2006/picture">
+            <wp:extent cx="3200400" cy="6929147"/>
+            <wp:docPr id="11" name="Picture 11"/>
+            <wp:cNvGraphicFramePr>
+              <a:graphicFrameLocks noChangeAspect="1"/>
+            </wp:cNvGraphicFramePr>
+            <a:graphic>
+              <a:graphicData uri="http://schemas.openxmlformats.org/drawingml/2006/picture">
+                <pic:pic>
+                  <pic:nvPicPr>
+                    <pic:cNvPr id="0" name="20-transactions-mobile.jpg"/>
+                    <pic:cNvPicPr/>
+                  </pic:nvPicPr>
+                  <pic:blipFill>
+                    <a:blip r:embed="rId19"/>
+                    <a:stretch>
+                      <a:fillRect/>
+                    </a:stretch>
+                  </pic:blipFill>
+                  <pic:spPr>
+                    <a:xfrm>
+                      <a:off x="0" y="0"/>
+                      <a:ext cx="3200400" cy="6929147"/>
+                    </a:xfrm>
+                    <a:prstGeom prst="rect"/>
+                  </pic:spPr>
+                </pic:pic>
+              </a:graphicData>
+            </a:graphic>
+          </wp:inline>
+        </w:drawing>
+      </w:r>
+    </w:p>
+    <w:p>
+      <w:pPr>
+        <w:jc w:val="center"/>
+      </w:pPr>
+      <w:r>
+        <w:rPr>
+          <w:i/>
+          <w:color w:val="666666"/>
+          <w:sz w:val="18"/>
+        </w:rPr>
+        <w:t>Figure: Same filter pills on mobile.</w:t>
       </w:r>
     </w:p>
     <w:p>

</xml_diff>